<commit_message>
commiting updated renv on final end to end test (ran end to end and then ran renv::snapshot())
</commit_message>
<xml_diff>
--- a/Outputs/Tables/T1.docx
+++ b/Outputs/Tables/T1.docx
@@ -11184,72 +11184,7 @@
                 <w:szCs w:val="12"/>
                 <w:color w:val="000000"/>
               </w:rPr>
-              <w:t xml:space="preserve">Statistical Methods: For continuous variables, normality was assessed using the Shapiro–Wilk test (when enabled). Normally distributed variables were summarized as mean ± SD and compared using Welch's t-test for two-group comparisons or one-way ANOVA for three-group comparisons. Non-normally distributed or user-specified ordinal variables were summarized as median [IQR] and compared using the Wilcoxon rank-sum test (two groups) or Kruskal–Wallis test (three groups). Categorical variables were summarized as n (%) and compared using Chi-squared tests or Fisher's exact tests when expected counts were &lt;5. For binary categorical variables, odds ratios with 95% confidence intervals were computed using Fisher's exact or Wald methods, as appropriate. Approximate p-values were used for non-parametric tests with tied data.</w:t>
-            </w:r>
-            <w:r>
-              <w:rPr>
-                <w:rFonts w:ascii="Arial" w:hAnsi="Arial" w:eastAsia="Arial" w:cs="Arial"/>
-                <w:i w:val="true"/>
-                <w:b w:val="false"/>
-                <w:u w:val="none"/>
-                <w:strike w:val="false"/>
-                <w:sz w:val="12"/>
-                <w:szCs w:val="12"/>
-                <w:color w:val="000000"/>
-              </w:rPr>
-              <w:br/>
-            </w:r>
-            <w:r>
-              <w:rPr>
-                <w:rFonts w:ascii="Arial" w:hAnsi="Arial" w:eastAsia="Arial" w:cs="Arial"/>
-                <w:i w:val="true"/>
-                <w:b w:val="false"/>
-                <w:u w:val="none"/>
-                <w:strike w:val="false"/>
-                <w:sz w:val="12"/>
-                <w:szCs w:val="12"/>
-                <w:color w:val="000000"/>
-              </w:rPr>
-              <w:br/>
-            </w:r>
-            <w:r>
-              <w:rPr>
-                <w:rFonts w:ascii="Arial" w:hAnsi="Arial" w:eastAsia="Arial" w:cs="Arial"/>
-                <w:i w:val="true"/>
-                <w:b w:val="false"/>
-                <w:u w:val="none"/>
-                <w:strike w:val="false"/>
-                <w:sz w:val="12"/>
-                <w:szCs w:val="12"/>
-                <w:color w:val="000000"/>
-              </w:rPr>
-              <w:t xml:space="preserve">*- All values are presented as mean ± SD for normally distributed continuous variables, median [IQR] for non-normally distributed continuous or ordinal variables, and n (%) for categorical variables.</w:t>
-            </w:r>
-            <w:r>
-              <w:rPr>
-                <w:rFonts w:ascii="Arial" w:hAnsi="Arial" w:eastAsia="Arial" w:cs="Arial"/>
-                <w:i w:val="true"/>
-                <w:b w:val="false"/>
-                <w:u w:val="none"/>
-                <w:strike w:val="false"/>
-                <w:sz w:val="12"/>
-                <w:szCs w:val="12"/>
-                <w:color w:val="000000"/>
-              </w:rPr>
-              <w:br/>
-            </w:r>
-            <w:r>
-              <w:rPr>
-                <w:rFonts w:ascii="Arial" w:hAnsi="Arial" w:eastAsia="Arial" w:cs="Arial"/>
-                <w:i w:val="true"/>
-                <w:b w:val="false"/>
-                <w:u w:val="none"/>
-                <w:strike w:val="false"/>
-                <w:sz w:val="12"/>
-                <w:szCs w:val="12"/>
-                <w:color w:val="000000"/>
-              </w:rPr>
-              <w:t xml:space="preserve">†- Welch's t-test was used to compute p-values for normally distributed continuous variables. Wilcoxon Rank Sum test was used to compute p-values for non-normally distributed continuous or ordinal variables. Fisher's exact or chi-squared test was used to compute p-values for categorical variables, as appropriate. p-values are bolded for p ≤ 0.05.</w:t>
+              <w:t xml:space="preserve">†- Continuous variables are presented as mean ± SD for normally distributed variables or median [IQR] for non-normally distributed or ordinal variables. Categorical variables are presented as n (%).</w:t>
             </w:r>
           </w:p>
         </w:tc>

</xml_diff>